<commit_message>
Datenmodell: Gesamtübersicht mit allen Verweisen als Querformat-Seite
Neue Seite 5 im Datenmodell (DIN A4 quer): alle 14 Tabellen mit allen
Spalten und alle 27 Fremdschlüssel, die zehn Verweise auf benutzer orange.
Inhaltsverzeichnis und Seitenzahlen nachgezogen, Verweis unter dem
ER-Diagramm auf Seite 3. Das Diagramm erzeugt er-diagramm-detail.js.

Co-Authored-By: Claude Opus 5.5 <noreply@anthropic.com>
Claude-Session: https://claude.ai/code/session_01MZkQWzcPzQ5rxZLPqdc4cQ
</commit_message>
<xml_diff>
--- a/doku/Datenmodell_FA-Digital.docx
+++ b/doku/Datenmodell_FA-Digital.docx
@@ -310,6 +310,67 @@
     </w:p>
     <w:p>
       <w:pPr>
+        <w:pStyle w:val="Verzeichnis2"/>
+        <w:tabs>
+          <w:tab w:val="right" w:leader="dot" w:pos="9063"/>
+        </w:tabs>
+        <w:rPr>
+          <w:rFonts w:asciiTheme="minorHAnsi" w:eastAsiaTheme="minorEastAsia" w:hAnsiTheme="minorHAnsi"/>
+          <w:noProof/>
+          <w:sz w:val="24"/>
+          <w:lang w:eastAsia="de-DE"/>
+        </w:rPr>
+      </w:pPr>
+      <w:r>
+        <w:rPr>
+          <w:noProof/>
+        </w:rPr>
+        <w:t>Gesamtübersicht mit allen Verweisen</w:t>
+      </w:r>
+      <w:r>
+        <w:rPr>
+          <w:noProof/>
+        </w:rPr>
+        <w:tab/>
+      </w:r>
+      <w:r>
+        <w:rPr>
+          <w:noProof/>
+        </w:rPr>
+        <w:fldChar w:fldCharType="begin"/>
+      </w:r>
+      <w:r>
+        <w:rPr>
+          <w:noProof/>
+        </w:rPr>
+        <w:instrText xml:space="preserve"> PAGEREF _Toc242611416 \h </w:instrText>
+      </w:r>
+      <w:r>
+        <w:rPr>
+          <w:noProof/>
+        </w:rPr>
+      </w:r>
+      <w:r>
+        <w:rPr>
+          <w:noProof/>
+        </w:rPr>
+        <w:fldChar w:fldCharType="separate"/>
+      </w:r>
+      <w:r>
+        <w:rPr>
+          <w:noProof/>
+        </w:rPr>
+        <w:t>5</w:t>
+      </w:r>
+      <w:r>
+        <w:rPr>
+          <w:noProof/>
+        </w:rPr>
+        <w:fldChar w:fldCharType="end"/>
+      </w:r>
+    </w:p>
+    <w:p>
+      <w:pPr>
         <w:pStyle w:val="Verzeichnis1"/>
         <w:tabs>
           <w:tab w:val="right" w:leader="dot" w:pos="9063"/>
@@ -360,7 +421,7 @@
         <w:rPr>
           <w:noProof/>
         </w:rPr>
-        <w:t>5</w:t>
+        <w:t>6</w:t>
       </w:r>
       <w:r>
         <w:rPr>
@@ -421,7 +482,7 @@
         <w:rPr>
           <w:noProof/>
         </w:rPr>
-        <w:t>5</w:t>
+        <w:t>6</w:t>
       </w:r>
       <w:r>
         <w:rPr>
@@ -482,7 +543,7 @@
         <w:rPr>
           <w:noProof/>
         </w:rPr>
-        <w:t>7</w:t>
+        <w:t>8</w:t>
       </w:r>
       <w:r>
         <w:rPr>
@@ -543,7 +604,7 @@
         <w:rPr>
           <w:noProof/>
         </w:rPr>
-        <w:t>9</w:t>
+        <w:t>10</w:t>
       </w:r>
       <w:r>
         <w:rPr>
@@ -604,7 +665,7 @@
         <w:rPr>
           <w:noProof/>
         </w:rPr>
-        <w:t>9</w:t>
+        <w:t>10</w:t>
       </w:r>
       <w:r>
         <w:rPr>
@@ -665,7 +726,7 @@
         <w:rPr>
           <w:noProof/>
         </w:rPr>
-        <w:t>10</w:t>
+        <w:t>11</w:t>
       </w:r>
       <w:r>
         <w:rPr>
@@ -726,7 +787,7 @@
         <w:rPr>
           <w:noProof/>
         </w:rPr>
-        <w:t>10</w:t>
+        <w:t>11</w:t>
       </w:r>
       <w:r>
         <w:rPr>
@@ -787,7 +848,7 @@
         <w:rPr>
           <w:noProof/>
         </w:rPr>
-        <w:t>11</w:t>
+        <w:t>12</w:t>
       </w:r>
       <w:r>
         <w:rPr>
@@ -848,7 +909,7 @@
         <w:rPr>
           <w:noProof/>
         </w:rPr>
-        <w:t>12</w:t>
+        <w:t>13</w:t>
       </w:r>
       <w:r>
         <w:rPr>
@@ -909,7 +970,7 @@
         <w:rPr>
           <w:noProof/>
         </w:rPr>
-        <w:t>12</w:t>
+        <w:t>13</w:t>
       </w:r>
       <w:r>
         <w:rPr>
@@ -970,7 +1031,7 @@
         <w:rPr>
           <w:noProof/>
         </w:rPr>
-        <w:t>12</w:t>
+        <w:t>13</w:t>
       </w:r>
       <w:r>
         <w:rPr>
@@ -1031,7 +1092,7 @@
         <w:rPr>
           <w:noProof/>
         </w:rPr>
-        <w:t>13</w:t>
+        <w:t>14</w:t>
       </w:r>
       <w:r>
         <w:rPr>
@@ -1092,7 +1153,7 @@
         <w:rPr>
           <w:noProof/>
         </w:rPr>
-        <w:t>13</w:t>
+        <w:t>14</w:t>
       </w:r>
       <w:r>
         <w:rPr>
@@ -1153,7 +1214,7 @@
         <w:rPr>
           <w:noProof/>
         </w:rPr>
-        <w:t>13</w:t>
+        <w:t>14</w:t>
       </w:r>
       <w:r>
         <w:rPr>
@@ -1694,6 +1755,29 @@
       </w:r>
     </w:p>
     <w:p>
+      <w:r>
+        <w:t xml:space="preserve">Die Gesamtübersicht auf Seite </w:t>
+      </w:r>
+      <w:r>
+        <w:fldChar w:fldCharType="begin"/>
+      </w:r>
+      <w:r>
+        <w:instrText xml:space="preserve"> PAGEREF _Toc242611416 \h </w:instrText>
+      </w:r>
+      <w:r>
+        <w:fldChar w:fldCharType="separate"/>
+      </w:r>
+      <w:r>
+        <w:t>5</w:t>
+      </w:r>
+      <w:r>
+        <w:fldChar w:fldCharType="end"/>
+      </w:r>
+      <w:r>
+        <w:t xml:space="preserve"> zeigt alle Spalten und alle 27 Verweise, auch die zehn auf benutzer.</w:t>
+      </w:r>
+    </w:p>
+    <w:p>
       <w:pPr>
         <w:pStyle w:val="berschrift2"/>
       </w:pPr>
@@ -1816,6 +1900,18 @@
     <w:p>
       <w:pPr>
         <w:pStyle w:val="Aufzhlungszeichen"/>
+        <w:sectPr>
+          <w:headerReference w:type="even" r:id="rId8"/>
+          <w:headerReference w:type="default" r:id="rId9"/>
+          <w:footerReference w:type="even" r:id="rId10"/>
+          <w:footerReference w:type="default" r:id="rId11"/>
+          <w:headerReference w:type="first" r:id="rId12"/>
+          <w:footerReference w:type="first" r:id="rId13"/>
+          <w:pgSz w:w="11907" w:h="16839"/>
+          <w:pgMar w:top="1417" w:right="1417" w:bottom="1417" w:left="1417" w:header="708" w:footer="708" w:gutter="0"/>
+          <w:cols w:space="708"/>
+          <w:docGrid w:linePitch="360"/>
+        </w:sectPr>
       </w:pPr>
       <w:r>
         <w:rPr>
@@ -1825,6 +1921,79 @@
       </w:r>
       <w:r>
         <w:t>utf8mb4 mit deutscher Sortierung, damit Umlaute und Zeichen wie Ø und µ richtig gespeichert und sortiert werden.</w:t>
+      </w:r>
+    </w:p>
+    <w:p>
+      <w:pPr>
+        <w:pStyle w:val="berschrift2"/>
+        <w:spacing w:before="0"/>
+      </w:pPr>
+      <w:bookmarkStart w:id="18" w:name="_Toc242611416"/>
+      <w:r>
+        <w:t>Gesamtübersicht mit allen Verweisen</w:t>
+      </w:r>
+      <w:bookmarkEnd w:id="18"/>
+    </w:p>
+    <w:p>
+      <w:r>
+        <w:t>Die Übersicht zeigt alle 14 Tabellen mit allen Spalten und alle 27 Fremdschlüssel. Orange sind die zehn Verweise auf benutzer: Sie halten fest, wer etwas angelegt, freigegeben, gemeldet, geprüft, gebucht oder geändert hat.</w:t>
+      </w:r>
+    </w:p>
+    <w:p>
+      <w:pPr>
+        <w:spacing w:after="0" w:line="240" w:lineRule="auto"/>
+        <w:sectPr>
+          <w:headerReference w:type="even" r:id="rId8"/>
+          <w:headerReference w:type="default" r:id="rId9"/>
+          <w:footerReference w:type="even" r:id="rId10"/>
+          <w:footerReference w:type="default" r:id="rId11"/>
+          <w:headerReference w:type="first" r:id="rId12"/>
+          <w:footerReference w:type="first" r:id="rId13"/>
+          <w:pgSz w:w="16839" w:h="11907" w:orient="landscape"/>
+          <w:pgMar w:top="850" w:right="850" w:bottom="850" w:left="850" w:header="567" w:footer="454" w:gutter="0"/>
+          <w:cols w:space="708"/>
+          <w:docGrid w:linePitch="360"/>
+        </w:sectPr>
+      </w:pPr>
+      <w:r>
+        <w:rPr>
+          <w:noProof/>
+        </w:rPr>
+        <w:drawing>
+          <wp:inline distT="0" distB="0" distL="0" distR="0">
+            <wp:extent cx="9612000" cy="5544000"/>
+            <wp:effectExtent l="0" t="0" r="0" b="0"/>
+            <wp:docPr id="317607434" name="Grafik 2" descr="Gesamtübersicht des Datenmodells: alle Tabellen mit allen Spalten und alle Fremdschlüssel, die Verweise auf benutzer orange"/>
+            <wp:cNvGraphicFramePr>
+              <a:graphicFrameLocks xmlns:a="http://schemas.openxmlformats.org/drawingml/2006/main" noChangeAspect="1"/>
+            </wp:cNvGraphicFramePr>
+            <a:graphic xmlns:a="http://schemas.openxmlformats.org/drawingml/2006/main">
+              <a:graphicData uri="http://schemas.openxmlformats.org/drawingml/2006/picture">
+                <pic:pic xmlns:pic="http://schemas.openxmlformats.org/drawingml/2006/picture">
+                  <pic:nvPicPr>
+                    <pic:cNvPr id="317607434" name="er-diagramm-detail.png"/>
+                    <pic:cNvPicPr/>
+                  </pic:nvPicPr>
+                  <pic:blipFill>
+                    <a:blip r:embed="rId100"/>
+                    <a:stretch>
+                      <a:fillRect/>
+                    </a:stretch>
+                  </pic:blipFill>
+                  <pic:spPr>
+                    <a:xfrm>
+                      <a:off x="0" y="0"/>
+                      <a:ext cx="9612000" cy="5544000"/>
+                    </a:xfrm>
+                    <a:prstGeom prst="rect">
+                      <a:avLst/>
+                    </a:prstGeom>
+                  </pic:spPr>
+                </pic:pic>
+              </a:graphicData>
+            </a:graphic>
+          </wp:inline>
+        </w:drawing>
       </w:r>
     </w:p>
     <w:p>

</xml_diff>